<commit_message>
Resume: Cyber Security Intern @ Innovexis (startup)
</commit_message>
<xml_diff>
--- a/resumes/Resume_Cyber_Security_Intern_Innovexis__startup_.docx
+++ b/resumes/Resume_Cyber_Security_Intern_Innovexis__startup_.docx
@@ -413,7 +413,7 @@
           <w:sz w:val="19"/>
           <w:szCs w:val="19"/>
         </w:rPr>
-        <w:t>Triaged 50+ weekly inventory reimbursement cases by severity and policy eligibility, applying structured workflows for efficient decision-making.</w:t>
+        <w:t>Triaged 50+ weekly inventory reimbursement cases by severity and policy eligibility, following structured case triage and escalation workflows to optimize process efficiency.</w:t>
       </w:r>
     </w:p>
     <w:p>
@@ -432,7 +432,7 @@
           <w:sz w:val="19"/>
           <w:szCs w:val="19"/>
         </w:rPr>
-        <w:t>Conducted root cause analysis on seller claims, identifying policy violations and anomalous patterns, and escalated findings to senior reviewers for timely decision-making and risk management.</w:t>
+        <w:t>Investigated seller claims, identified policy violations and anomalous patterns, and escalated findings to senior reviewers to ensure structured decision-making.</w:t>
       </w:r>
     </w:p>
     <w:p>
@@ -451,7 +451,7 @@
           <w:sz w:val="19"/>
           <w:szCs w:val="19"/>
         </w:rPr>
-        <w:t>Maintained audit-ready case documentation, recording investigation findings, decisions, corrective actions, and evidence notes, to ensure compliance and security protocols.</w:t>
+        <w:t>Maintained audit-ready case documentation recording investigation findings, decisions, evidence notes, and corrective actions to streamline workflow optimization.</w:t>
       </w:r>
     </w:p>
     <w:p>
@@ -470,7 +470,7 @@
           <w:sz w:val="19"/>
           <w:szCs w:val="19"/>
         </w:rPr>
-        <w:t>Identified recurring fraud patterns in 200+ weekly cases, reducing repeat-issue investigation time and improving risk management and SIEM.</w:t>
+        <w:t>Spotted recurring fraud patterns across 200+ weekly cases and flagged them early, reducing repeat-issue investigation time before escalation to improve risk management.</w:t>
       </w:r>
     </w:p>
     <w:p>
@@ -564,7 +564,7 @@
           <w:sz w:val="19"/>
           <w:szCs w:val="19"/>
         </w:rPr>
-        <w:t>Deployed Splunk SIEM with SPL searches for brute-force detection, lateral movement, and privilege escalation; mapped TTPs to MITRE ATT&amp;CK (T1110, T1078, T1059) and wrote incident report.</w:t>
+        <w:t>Deployed Splunk SIEM with SPL searches for brute-force detection, lateral movement, and privilege escalation, mapping to MITRE ATT&amp;CK (T1110, T1078, T1059) and writing incident reports.</w:t>
       </w:r>
     </w:p>
     <w:p>
@@ -583,7 +583,7 @@
           <w:sz w:val="19"/>
           <w:szCs w:val="19"/>
         </w:rPr>
-        <w:t>Built automated SOAR-style detection pipeline: ingests Splunk alerts, enriches with VirusTotal API, dispatches Telegram notifications with severity classification.</w:t>
+        <w:t>Built automated SOAR-style detection pipeline: Python script ingests Splunk alerts, enriches with VirusTotal API, and dispatches Telegram notifications with severity classification.</w:t>
       </w:r>
     </w:p>
     <w:p>
@@ -602,7 +602,7 @@
           <w:sz w:val="19"/>
           <w:szCs w:val="19"/>
         </w:rPr>
-        <w:t>Converted detection logic to Sigma rules (detection-as-code) for enterprise SOCs; analyzed TCP/IP traffic in Wireshark for SYN scans, DNS tunnelling, and plaintext credential exposure.</w:t>
+        <w:t>Converted detection logic to Sigma rules; analyzed TCP/IP traffic in Wireshark for SYN scans, DNS tunnelling, and plaintext credential exposure.</w:t>
       </w:r>
     </w:p>
     <w:p>
@@ -672,7 +672,7 @@
           <w:sz w:val="19"/>
           <w:szCs w:val="19"/>
         </w:rPr>
-        <w:t>Developed automated vulnerability assessment pipeline integrating Nessus, OpenVAS, and FIRST.org APIs in Python, generating CVE reports with CVSS severity and EPSS scoring for prioritization.</w:t>
+        <w:t>Developed automated vulnerability assessment pipeline in Python, integrating Nessus and OpenVAS APIs, and leveraging EPSS scoring from FIRST.org for prioritization.</w:t>
       </w:r>
     </w:p>
     <w:p>
@@ -710,7 +710,7 @@
           <w:sz w:val="19"/>
           <w:szCs w:val="19"/>
         </w:rPr>
-        <w:t>Automated scan scheduling via Bash and cron; built delta-scan logic for CVE flagging and remediation SLA deadlines (Critical=24hrs, High=7 days, Medium=30 days).</w:t>
+        <w:t>Automated scan scheduling via Bash and cron, flagging newly discovered CVEs with remediation SLA deadlines (Critical=24hrs, High=7 days, Medium=30 days).</w:t>
       </w:r>
     </w:p>
     <w:p>
@@ -846,7 +846,7 @@
           <w:sz w:val="19"/>
           <w:szCs w:val="19"/>
         </w:rPr>
-        <w:t>Python, Bash (basic), regular expressions, incident response, compliance, firewall management</w:t>
+        <w:t>Python, Bash (basic), regular expressions, incident response, firewall management</w:t>
       </w:r>
     </w:p>
     <w:p>

</xml_diff>